<commit_message>
Clean the Stacy correspondence, bring it current, and assess the odds
Removed four machine cadences across the message and the Council
submission, then re-scanned all three documents against a pattern set
covering bolded lead-ins, "Here is/are", "worth noting", "That said",
"That is the X", "exactly what/why" and both dash types. All clean.

All three now carry the employment cross-domain result, so the message
can tell her that her null is a boundary condition with evidence on both
sides rather than a gap.

Publication odds filed: roughly 8 in 10 at the Journal of Civic
Information, about 9 in 10 with a second reader on ten cases, which is
the one action that removes the objection every referee will raise.

Co-Authored-By: Claude Opus 5 <noreply@anthropic.com>
Claude-Session: https://claude.ai/code/session_01W9UtE7X76spacWeSvBH7tv
</commit_message>
<xml_diff>
--- a/research/CFOC_Submission_2026-08-08.docx
+++ b/research/CFOC_Submission_2026-08-08.docx
@@ -140,7 +140,7 @@
         <w:spacing w:after="140"/>
       </w:pPr>
       <w:r>
-        <w:t xml:space="preserve">A fourth check found no relationship between the read and whether an agency prevailed on appeal, and the study reports that plainly. Published cases are selected for contested legal questions rather than thin files, which is why audit findings, not appellate outcomes, are the outcome measure a records programme can act on.</w:t>
+        <w:t xml:space="preserve">A fourth check found no relationship between the read and whether an agency prevailed on appeal, and the study reports that plainly. Published cases are selected for contested legal questions rather than thin files, which is why audit findings, and not appellate outcomes, are the measure a records programme can act on. That reading has since been tested. The same instrument applied in a second domain, employment and labour matters, on 22 adjudicated cases that are not filtered by publication practice, does show the association: records assessed as complete were sustained in six of eight resolved cases against one of eight for records assessed as incomplete, p = 0.041.</w:t>
       </w:r>
     </w:p>
     <w:p>
@@ -266,7 +266,7 @@
         <w:spacing w:after="140"/>
       </w:pPr>
       <w:r>
-        <w:t xml:space="preserve">I have just completed an empirical study of documentation quality in public-records determinations, covering 32 real cases across court decisions, open-government advisory opinions, state commission decisions and Comptroller compliance audits. The central result is that a structured read of the record agreed with independent government auditors in every case where both assessments existed. A manuscript is under submission.</w:t>
+        <w:t xml:space="preserve">I have just completed an empirical study of documentation quality in public-records determinations, covering 32 real cases across court decisions, open-government advisory opinions, state commission decisions and Comptroller compliance audits, with decisions spanning 2005 to 2026. The central result is that a structured read of the record agreed with independent government auditors in every case where both assessments existed, five of five. A manuscript is under submission, and a companion study in a second domain finds the same read associated with whether a decision was sustained on review.</w:t>
       </w:r>
     </w:p>
     <w:p>
@@ -354,7 +354,7 @@
         <w:spacing w:after="140"/>
       </w:pPr>
       <w:r>
-        <w:t xml:space="preserve">The submission to Dr. Frazier offers the protocol, the case set and the analysis without charge. That is the right posture: the asset here is the category and the evidence base, and a federal inventory citing the work is worth considerably more than a licence fee from a single agency.</w:t>
+        <w:t xml:space="preserve">The submission to Dr. Frazier offers the protocol, the case set and the analysis without charge. The asset here is the category and the evidence base, and a federal inventory citing the work is worth considerably more than a licence fee from any single agency.</w:t>
       </w:r>
     </w:p>
     <w:p>

</xml_diff>

<commit_message>
Strip the Council submission file to the two emails only
The header note block and the "Notes for Phillip" section are out. The
file now carries Email 1 of 2 to Dr. Frazier and Email 2 of 2 to the
Council, each with its To line, Subject line, body and signature.

The three operational notes removed are preserved in the tracker.

Co-Authored-By: Claude Opus 5 <noreply@anthropic.com>
Claude-Session: https://claude.ai/code/session_01W9UtE7X76spacWeSvBH7tv
</commit_message>
<xml_diff>
--- a/research/CFOC_Submission_2026-08-08.docx
+++ b/research/CFOC_Submission_2026-08-08.docx
@@ -8,7 +8,7 @@
         <w:spacing w:after="140"/>
       </w:pPr>
       <w:r>
-        <w:t xml:space="preserve">Chief FOIA Officers Council: two submissions, both in Stacy Young's name</w:t>
+        <w:t xml:space="preserve">Email 1 of 2</w:t>
       </w:r>
     </w:p>
     <w:p>
@@ -17,36 +17,12 @@
       </w:pPr>
       <w:r>
         <w:rPr>
-          <w:i/>
+          <w:b/>
         </w:rPr>
-        <w:t xml:space="preserve">Drawn from the Council's 28 May 2026 memorandum from Alina M. Semo and Sean D. Glendening, which does two things this work maps onto: Dr. Jeremy Frazier at Interior is building a government-wide inventory of FOIA technology solutions, and the Council is recruiting volunteers for its Technology Committee and its Committee on Cross-Agency Collaboration and Innovation. Both notes below go out in Stacy's name with Phillip second, because she is the federal-adjacent public-records practitioner and the memo is addressed to people in her role. Send after she approves. No long dashes.</w:t>
-      </w:r>
-    </w:p>
-    <w:p>
-      <w:pPr>
-        <w:spacing w:after="140"/>
-      </w:pPr>
-      <w:r>
-        <w:rPr>
-          <w:i/>
-        </w:rPr>
-        <w:t xml:space="preserve">Addresses from the memorandum: jeremy.frazier@sol.doi.gov, (803) 586-5040, and CFOCouncil@nara.gov.</w:t>
-      </w:r>
-    </w:p>
-    <w:p>
-      <w:pPr>
-        <w:pBdr>
-          <w:bottom w:val="single" w:sz="6" w:space="1" w:color="AAAAAA"/>
-        </w:pBdr>
-      </w:pPr>
-    </w:p>
-    <w:p>
-      <w:pPr>
-        <w:pStyle w:val="Heading2"/>
-        <w:spacing w:after="140"/>
-      </w:pPr>
-      <w:r>
-        <w:t xml:space="preserve">1. To Dr. Jeremy Frazier, on the technology inventory</w:t>
+        <w:t xml:space="preserve">To:</w:t>
+      </w:r>
+      <w:r>
+        <w:t xml:space="preserve"> jeremy.frazier@sol.doi.gov</w:t>
       </w:r>
     </w:p>
     <w:p>
@@ -216,11 +192,25 @@
     </w:p>
     <w:p>
       <w:pPr>
-        <w:pStyle w:val="Heading2"/>
-        <w:spacing w:after="140"/>
-      </w:pPr>
-      <w:r>
-        <w:t xml:space="preserve">2. To CFOCouncil@nara.gov, volunteering for the Technology Committee</w:t>
+        <w:pStyle w:val="Heading1"/>
+        <w:spacing w:after="140"/>
+      </w:pPr>
+      <w:r>
+        <w:t xml:space="preserve">Email 2 of 2</w:t>
+      </w:r>
+    </w:p>
+    <w:p>
+      <w:pPr>
+        <w:spacing w:after="140"/>
+      </w:pPr>
+      <w:r>
+        <w:rPr>
+          <w:b/>
+        </w:rPr>
+        <w:t xml:space="preserve">To:</w:t>
+      </w:r>
+      <w:r>
+        <w:t xml:space="preserve"> CFOCouncil@nara.gov</w:t>
       </w:r>
     </w:p>
     <w:p>
@@ -315,54 +305,6 @@
       </w:pPr>
       <w:r>
         <w:t xml:space="preserve">NYC Department of Housing Preservation and Development</w:t>
-      </w:r>
-    </w:p>
-    <w:p>
-      <w:pPr>
-        <w:pBdr>
-          <w:bottom w:val="single" w:sz="6" w:space="1" w:color="AAAAAA"/>
-        </w:pBdr>
-      </w:pPr>
-    </w:p>
-    <w:p>
-      <w:pPr>
-        <w:pStyle w:val="Heading2"/>
-        <w:spacing w:after="140"/>
-      </w:pPr>
-      <w:r>
-        <w:t xml:space="preserve">Notes for Phillip, not for sending</w:t>
-      </w:r>
-    </w:p>
-    <w:p>
-      <w:pPr>
-        <w:spacing w:after="140"/>
-      </w:pPr>
-      <w:r>
-        <w:t xml:space="preserve">Both notes are deliberately short and lead with her role rather than with the standard. A memorandum addressed to Chief FOIA Officers is answered by a FOIA officer, not by a vendor, and the fastest way to lose the room is to arrive selling something.</w:t>
-      </w:r>
-    </w:p>
-    <w:p>
-      <w:pPr>
-        <w:spacing w:after="140"/>
-      </w:pPr>
-      <w:r>
-        <w:t xml:space="preserve">Neither note names the standard by its trademark or links the site. The work is described by what it does. If Dr. Frazier or the Council asks what the instrument is, that is the moment to name it, and the answer lands better as a response to a question than as an opening claim.</w:t>
-      </w:r>
-    </w:p>
-    <w:p>
-      <w:pPr>
-        <w:spacing w:after="140"/>
-      </w:pPr>
-      <w:r>
-        <w:t xml:space="preserve">The submission to Dr. Frazier offers the protocol, the case set and the analysis without charge. The asset here is the category and the evidence base, and a federal inventory citing the work is worth considerably more than a licence fee from any single agency.</w:t>
-      </w:r>
-    </w:p>
-    <w:p>
-      <w:pPr>
-        <w:spacing w:after="140"/>
-      </w:pPr>
-      <w:r>
-        <w:t xml:space="preserve">Send after Stacy approves both, and let her edit her own biography paragraph in either note.</w:t>
       </w:r>
     </w:p>
     <w:sectPr>

</xml_diff>

<commit_message>
Apply her affiliation policy to the manuscript and both Council notes
Manuscript author line becomes Stacyann Young, Independent Researcher,
with the reason recorded in the disclosure so an absent affiliation does
not read as an omission. Both Council notes open with her own background
paragraph in place of a title and sign as Independent Researcher.

One line in the second letter identified the agency without naming it
and was rewritten rather than deleted. Dossier gains an affiliation
policy section so nothing reintroduces her employer.

Co-Authored-By: Claude Opus 5 <noreply@anthropic.com>
Claude-Session: https://claude.ai/code/session_01W9UtE7X76spacWeSvBH7tv
</commit_message>
<xml_diff>
--- a/research/CFOC_Submission_2026-08-08.docx
+++ b/research/CFOC_Submission_2026-08-08.docx
@@ -52,15 +52,15 @@
         <w:spacing w:after="140"/>
       </w:pPr>
       <w:r>
-        <w:t xml:space="preserve">I am the Deputy Records Access Officer at the New York City Department of Housing Preservation and Development, and I have spent more than twenty years in New York City public-records operations across housing, transportation and environmental agencies.</w:t>
-      </w:r>
-    </w:p>
-    <w:p>
-      <w:pPr>
-        <w:spacing w:after="140"/>
-      </w:pPr>
-      <w:r>
-        <w:t xml:space="preserve">I am writing about the inventory of FOIA technology solutions described in the Council's 28 May memorandum. I have just completed a study that sits directly alongside it and that may be useful as the inventory takes shape.</w:t>
+        <w:t xml:space="preserve">I have more than 20 years of experience working in New York City government, including extensive experience in public records access, FOIL administration, records management, and document review. My work has included reviewing records for disclosure, applying statutory exemptions, developing records access procedures, and working with complex public records requests. That experience informed my interest in examining whether the reasoning behind records access decisions can be reconstructed from the records themselves.</w:t>
+      </w:r>
+    </w:p>
+    <w:p>
+      <w:pPr>
+        <w:spacing w:after="140"/>
+      </w:pPr>
+      <w:r>
+        <w:t xml:space="preserve">I am writing in a personal capacity about the inventory of FOIA technology solutions described in the Council's 28 May memorandum. I have just completed a study that sits directly alongside it and that may be useful as the inventory takes shape.</w:t>
       </w:r>
     </w:p>
     <w:p>
@@ -148,23 +148,15 @@
         <w:spacing w:after="140"/>
       </w:pPr>
       <w:r>
-        <w:t xml:space="preserve">Stacy Young</w:t>
-      </w:r>
-    </w:p>
-    <w:p>
-      <w:pPr>
-        <w:spacing w:after="140"/>
-      </w:pPr>
-      <w:r>
-        <w:t xml:space="preserve">Deputy Records Access Officer</w:t>
-      </w:r>
-    </w:p>
-    <w:p>
-      <w:pPr>
-        <w:spacing w:after="140"/>
-      </w:pPr>
-      <w:r>
-        <w:t xml:space="preserve">NYC Department of Housing Preservation and Development</w:t>
+        <w:t xml:space="preserve">Stacyann Young</w:t>
+      </w:r>
+    </w:p>
+    <w:p>
+      <w:pPr>
+        <w:spacing w:after="140"/>
+      </w:pPr>
+      <w:r>
+        <w:t xml:space="preserve">Independent Researcher</w:t>
       </w:r>
     </w:p>
     <w:p>
@@ -248,7 +240,7 @@
         <w:spacing w:after="140"/>
       </w:pPr>
       <w:r>
-        <w:t xml:space="preserve">I am the Deputy Records Access Officer at the New York City Department of Housing Preservation and Development, where I lead cross-divisional public-records and regulatory operations. I have worked in New York City public-records administration since 2004, including as Assistant Freedom of Information Law Officer at the NYC Taxi and Limousine Commission and as Records Manager at the NYC Department of Environmental Protection, and I hold professional certifications through SUNY and the New York State Archives. My work sits where records operations, legal compliance and executive decision support meet.</w:t>
+        <w:t xml:space="preserve">I have more than 20 years of experience working in New York City government, including extensive experience in public records access, FOIL administration, records management, and document review. My work has included reviewing records for disclosure, applying statutory exemptions, developing records access procedures, and working with complex public records requests, and I hold professional certifications through SUNY and the New York State Archives. I am writing in a personal capacity.</w:t>
       </w:r>
     </w:p>
     <w:p>
@@ -264,7 +256,7 @@
         <w:spacing w:after="140"/>
       </w:pPr>
       <w:r>
-        <w:t xml:space="preserve">What I would bring to the Technology Committee is the perspective that sits next to the technology question rather than inside it: whether the determinations produced through any given system remain reviewable and defensible after the fact. As the Council builds its inventory of FOIA technology solutions, that companion measure seems worth having in the room, and I would be glad to contribute it alongside the operational experience of running a large city FOIL programme.</w:t>
+        <w:t xml:space="preserve">What I would bring to the Technology Committee is the perspective that sits next to the technology question rather than inside it: whether the determinations produced through any given system remain reviewable and defensible after the fact. As the Council builds its inventory of FOIA technology solutions, that companion measure seems worth having in the room, and I would be glad to contribute it alongside two decades of operational experience in municipal public-records administration.</w:t>
       </w:r>
     </w:p>
     <w:p>
@@ -288,23 +280,15 @@
         <w:spacing w:after="140"/>
       </w:pPr>
       <w:r>
-        <w:t xml:space="preserve">Stacy Young</w:t>
-      </w:r>
-    </w:p>
-    <w:p>
-      <w:pPr>
-        <w:spacing w:after="140"/>
-      </w:pPr>
-      <w:r>
-        <w:t xml:space="preserve">Deputy Records Access Officer</w:t>
-      </w:r>
-    </w:p>
-    <w:p>
-      <w:pPr>
-        <w:spacing w:after="140"/>
-      </w:pPr>
-      <w:r>
-        <w:t xml:space="preserve">NYC Department of Housing Preservation and Development</w:t>
+        <w:t xml:space="preserve">Stacyann Young</w:t>
+      </w:r>
+    </w:p>
+    <w:p>
+      <w:pPr>
+        <w:spacing w:after="140"/>
+      </w:pPr>
+      <w:r>
+        <w:t xml:space="preserve">Independent Researcher</w:t>
       </w:r>
     </w:p>
     <w:sectPr>

</xml_diff>